<commit_message>
docs: record executed experiment results
</commit_message>
<xml_diff>
--- a/docs/competition/策划书-强网杯实验增强版-20260926.docx
+++ b/docs/competition/策划书-强网杯实验增强版-20260926.docx
@@ -2123,6 +2123,586 @@
         <w:t>未经过数据集、配置和审计门禁的失败结果不得隐藏；指标未达标时保留负结果。</w:t>
       </w:r>
     </w:p>
+    <w:p>
+      <w:pPr>
+        <w:pStyle w:val="Heading1"/>
+      </w:pPr>
+      <w:r>
+        <w:t>九 实际实验结果与发布结论</w:t>
+      </w:r>
+    </w:p>
+    <w:p>
+      <w:pPr>
+        <w:spacing w:after="120" w:line="283" w:lineRule="auto"/>
+      </w:pPr>
+      <w:r>
+        <w:rPr>
+          <w:rFonts w:ascii="Microsoft YaHei" w:hAnsi="Microsoft YaHei" w:eastAsia="Microsoft YaHei"/>
+          <w:b w:val="0"/>
+          <w:sz w:val="21"/>
+        </w:rPr>
+        <w:t>截至 2026-09-26，安全、检索、因果和删除实验均已完成证据复核，但只有通过对应门禁的结果才能作为正式成绩。以下数字来自仓库原始 JSON，不是演示夹具。</w:t>
+      </w:r>
+    </w:p>
+    <w:tbl>
+      <w:tblPr>
+        <w:tblStyle w:val="TableGrid"/>
+        <w:tblW w:type="auto" w:w="0"/>
+        <w:jc w:val="center"/>
+        <w:tblLook w:firstColumn="1" w:firstRow="1" w:lastColumn="0" w:lastRow="0" w:noHBand="0" w:noVBand="1" w:val="04A0"/>
+      </w:tblPr>
+      <w:tblGrid>
+        <w:gridCol w:w="3331"/>
+        <w:gridCol w:w="3331"/>
+        <w:gridCol w:w="3331"/>
+      </w:tblGrid>
+      <w:tr>
+        <w:tc>
+          <w:tcPr>
+            <w:tcW w:type="dxa" w:w="3331"/>
+            <w:shd w:fill="1F4E78"/>
+            <w:vAlign w:val="center"/>
+            <w:tcBorders>
+              <w:top w:val="single" w:sz="4" w:color="D9D9D9"/>
+              <w:left w:val="single" w:sz="4" w:color="D9D9D9"/>
+              <w:bottom w:val="single" w:sz="4" w:color="D9D9D9"/>
+              <w:right w:val="single" w:sz="4" w:color="D9D9D9"/>
+              <w:insideH w:val="single" w:sz="4" w:color="D9D9D9"/>
+              <w:insideV w:val="single" w:sz="4" w:color="D9D9D9"/>
+            </w:tcBorders>
+          </w:tcPr>
+          <w:p>
+            <w:pPr>
+              <w:jc w:val="center"/>
+            </w:pPr>
+            <w:r/>
+            <w:r>
+              <w:rPr>
+                <w:rFonts w:ascii="Microsoft YaHei" w:hAnsi="Microsoft YaHei" w:eastAsia="Microsoft YaHei"/>
+                <w:b/>
+                <w:color w:val="FFFFFF"/>
+                <w:sz w:val="18"/>
+              </w:rPr>
+              <w:t>实验</w:t>
+            </w:r>
+          </w:p>
+        </w:tc>
+        <w:tc>
+          <w:tcPr>
+            <w:tcW w:type="dxa" w:w="3331"/>
+            <w:shd w:fill="1F4E78"/>
+            <w:vAlign w:val="center"/>
+            <w:tcBorders>
+              <w:top w:val="single" w:sz="4" w:color="D9D9D9"/>
+              <w:left w:val="single" w:sz="4" w:color="D9D9D9"/>
+              <w:bottom w:val="single" w:sz="4" w:color="D9D9D9"/>
+              <w:right w:val="single" w:sz="4" w:color="D9D9D9"/>
+              <w:insideH w:val="single" w:sz="4" w:color="D9D9D9"/>
+              <w:insideV w:val="single" w:sz="4" w:color="D9D9D9"/>
+            </w:tcBorders>
+          </w:tcPr>
+          <w:p>
+            <w:pPr>
+              <w:jc w:val="center"/>
+            </w:pPr>
+            <w:r/>
+            <w:r>
+              <w:rPr>
+                <w:rFonts w:ascii="Microsoft YaHei" w:hAnsi="Microsoft YaHei" w:eastAsia="Microsoft YaHei"/>
+                <w:b/>
+                <w:color w:val="FFFFFF"/>
+                <w:sz w:val="18"/>
+              </w:rPr>
+              <w:t>实际结果</w:t>
+            </w:r>
+          </w:p>
+        </w:tc>
+        <w:tc>
+          <w:tcPr>
+            <w:tcW w:type="dxa" w:w="3331"/>
+            <w:shd w:fill="1F4E78"/>
+            <w:vAlign w:val="center"/>
+            <w:tcBorders>
+              <w:top w:val="single" w:sz="4" w:color="D9D9D9"/>
+              <w:left w:val="single" w:sz="4" w:color="D9D9D9"/>
+              <w:bottom w:val="single" w:sz="4" w:color="D9D9D9"/>
+              <w:right w:val="single" w:sz="4" w:color="D9D9D9"/>
+              <w:insideH w:val="single" w:sz="4" w:color="D9D9D9"/>
+              <w:insideV w:val="single" w:sz="4" w:color="D9D9D9"/>
+            </w:tcBorders>
+          </w:tcPr>
+          <w:p>
+            <w:pPr>
+              <w:jc w:val="center"/>
+            </w:pPr>
+            <w:r/>
+            <w:r>
+              <w:rPr>
+                <w:rFonts w:ascii="Microsoft YaHei" w:hAnsi="Microsoft YaHei" w:eastAsia="Microsoft YaHei"/>
+                <w:b/>
+                <w:color w:val="FFFFFF"/>
+                <w:sz w:val="18"/>
+              </w:rPr>
+              <w:t>证据等级与结论</w:t>
+            </w:r>
+          </w:p>
+        </w:tc>
+      </w:tr>
+      <w:tr>
+        <w:tc>
+          <w:tcPr>
+            <w:tcW w:type="dxa" w:w="3331"/>
+            <w:vAlign w:val="center"/>
+            <w:tcBorders>
+              <w:top w:val="single" w:sz="4" w:color="D9D9D9"/>
+              <w:left w:val="single" w:sz="4" w:color="D9D9D9"/>
+              <w:bottom w:val="single" w:sz="4" w:color="D9D9D9"/>
+              <w:right w:val="single" w:sz="4" w:color="D9D9D9"/>
+              <w:insideH w:val="single" w:sz="4" w:color="D9D9D9"/>
+              <w:insideV w:val="single" w:sz="4" w:color="D9D9D9"/>
+            </w:tcBorders>
+          </w:tcPr>
+          <w:p>
+            <w:pPr>
+              <w:spacing w:after="0"/>
+            </w:pPr>
+            <w:r/>
+            <w:r>
+              <w:rPr>
+                <w:rFonts w:ascii="Microsoft YaHei" w:hAnsi="Microsoft YaHei" w:eastAsia="Microsoft YaHei"/>
+                <w:b w:val="0"/>
+                <w:sz w:val="18"/>
+              </w:rPr>
+              <w:t>安全确定性主链</w:t>
+            </w:r>
+          </w:p>
+        </w:tc>
+        <w:tc>
+          <w:tcPr>
+            <w:tcW w:type="dxa" w:w="3331"/>
+            <w:vAlign w:val="center"/>
+            <w:tcBorders>
+              <w:top w:val="single" w:sz="4" w:color="D9D9D9"/>
+              <w:left w:val="single" w:sz="4" w:color="D9D9D9"/>
+              <w:bottom w:val="single" w:sz="4" w:color="D9D9D9"/>
+              <w:right w:val="single" w:sz="4" w:color="D9D9D9"/>
+              <w:insideH w:val="single" w:sz="4" w:color="D9D9D9"/>
+              <w:insideV w:val="single" w:sz="4" w:color="D9D9D9"/>
+            </w:tcBorders>
+          </w:tcPr>
+          <w:p>
+            <w:pPr>
+              <w:spacing w:after="0"/>
+            </w:pPr>
+            <w:r/>
+            <w:r>
+              <w:rPr>
+                <w:rFonts w:ascii="Microsoft YaHei" w:hAnsi="Microsoft YaHei" w:eastAsia="Microsoft YaHei"/>
+                <w:b w:val="0"/>
+                <w:sz w:val="18"/>
+              </w:rPr>
+              <w:t>6677 条纯正样本，ASDF/CASIA/PCCM-S 检出率 94.22%，Wilson 95% CI 93.63%-94.75%</w:t>
+            </w:r>
+          </w:p>
+        </w:tc>
+        <w:tc>
+          <w:tcPr>
+            <w:tcW w:type="dxa" w:w="3331"/>
+            <w:vAlign w:val="center"/>
+            <w:tcBorders>
+              <w:top w:val="single" w:sz="4" w:color="D9D9D9"/>
+              <w:left w:val="single" w:sz="4" w:color="D9D9D9"/>
+              <w:bottom w:val="single" w:sz="4" w:color="D9D9D9"/>
+              <w:right w:val="single" w:sz="4" w:color="D9D9D9"/>
+              <w:insideH w:val="single" w:sz="4" w:color="D9D9D9"/>
+              <w:insideV w:val="single" w:sz="4" w:color="D9D9D9"/>
+            </w:tcBorders>
+          </w:tcPr>
+          <w:p>
+            <w:pPr>
+              <w:spacing w:after="0"/>
+            </w:pPr>
+            <w:r/>
+            <w:r>
+              <w:rPr>
+                <w:rFonts w:ascii="Microsoft YaHei" w:hAnsi="Microsoft YaHei" w:eastAsia="Microsoft YaHei"/>
+                <w:b w:val="0"/>
+                <w:sz w:val="18"/>
+              </w:rPr>
+              <w:t>受控实测；无良性分母，不能称准确率/F1；低于 95% 目标</w:t>
+            </w:r>
+          </w:p>
+        </w:tc>
+      </w:tr>
+      <w:tr>
+        <w:tc>
+          <w:tcPr>
+            <w:tcW w:type="dxa" w:w="3331"/>
+            <w:vAlign w:val="center"/>
+            <w:shd w:fill="F2F6FA"/>
+            <w:tcBorders>
+              <w:top w:val="single" w:sz="4" w:color="D9D9D9"/>
+              <w:left w:val="single" w:sz="4" w:color="D9D9D9"/>
+              <w:bottom w:val="single" w:sz="4" w:color="D9D9D9"/>
+              <w:right w:val="single" w:sz="4" w:color="D9D9D9"/>
+              <w:insideH w:val="single" w:sz="4" w:color="D9D9D9"/>
+              <w:insideV w:val="single" w:sz="4" w:color="D9D9D9"/>
+            </w:tcBorders>
+          </w:tcPr>
+          <w:p>
+            <w:pPr>
+              <w:spacing w:after="0"/>
+            </w:pPr>
+            <w:r/>
+            <w:r>
+              <w:rPr>
+                <w:rFonts w:ascii="Microsoft YaHei" w:hAnsi="Microsoft YaHei" w:eastAsia="Microsoft YaHei"/>
+                <w:b w:val="0"/>
+                <w:sz w:val="18"/>
+              </w:rPr>
+              <w:t>RRF 检索</w:t>
+            </w:r>
+          </w:p>
+        </w:tc>
+        <w:tc>
+          <w:tcPr>
+            <w:tcW w:type="dxa" w:w="3331"/>
+            <w:vAlign w:val="center"/>
+            <w:shd w:fill="F2F6FA"/>
+            <w:tcBorders>
+              <w:top w:val="single" w:sz="4" w:color="D9D9D9"/>
+              <w:left w:val="single" w:sz="4" w:color="D9D9D9"/>
+              <w:bottom w:val="single" w:sz="4" w:color="D9D9D9"/>
+              <w:right w:val="single" w:sz="4" w:color="D9D9D9"/>
+              <w:insideH w:val="single" w:sz="4" w:color="D9D9D9"/>
+              <w:insideV w:val="single" w:sz="4" w:color="D9D9D9"/>
+            </w:tcBorders>
+          </w:tcPr>
+          <w:p>
+            <w:pPr>
+              <w:spacing w:after="0"/>
+            </w:pPr>
+            <w:r/>
+            <w:r>
+              <w:rPr>
+                <w:rFonts w:ascii="Microsoft YaHei" w:hAnsi="Microsoft YaHei" w:eastAsia="Microsoft YaHei"/>
+                <w:b w:val="0"/>
+                <w:sz w:val="18"/>
+              </w:rPr>
+              <w:t>30 条查询，MRR 0.4172，Recall@5 0.6000，P50/P95 42.0/61.2 ms；22 条三路、8 条二路</w:t>
+            </w:r>
+          </w:p>
+        </w:tc>
+        <w:tc>
+          <w:tcPr>
+            <w:tcW w:type="dxa" w:w="3331"/>
+            <w:vAlign w:val="center"/>
+            <w:shd w:fill="F2F6FA"/>
+            <w:tcBorders>
+              <w:top w:val="single" w:sz="4" w:color="D9D9D9"/>
+              <w:left w:val="single" w:sz="4" w:color="D9D9D9"/>
+              <w:bottom w:val="single" w:sz="4" w:color="D9D9D9"/>
+              <w:right w:val="single" w:sz="4" w:color="D9D9D9"/>
+              <w:insideH w:val="single" w:sz="4" w:color="D9D9D9"/>
+              <w:insideV w:val="single" w:sz="4" w:color="D9D9D9"/>
+            </w:tcBorders>
+          </w:tcPr>
+          <w:p>
+            <w:pPr>
+              <w:spacing w:after="0"/>
+            </w:pPr>
+            <w:r/>
+            <w:r>
+              <w:rPr>
+                <w:rFonts w:ascii="Microsoft YaHei" w:hAnsi="Microsoft YaHei" w:eastAsia="Microsoft YaHei"/>
+                <w:b w:val="0"/>
+                <w:sz w:val="18"/>
+              </w:rPr>
+              <w:t>受控初步结果；来源审计通过，规模不足以宣称普遍提升</w:t>
+            </w:r>
+          </w:p>
+        </w:tc>
+      </w:tr>
+      <w:tr>
+        <w:tc>
+          <w:tcPr>
+            <w:tcW w:type="dxa" w:w="3331"/>
+            <w:vAlign w:val="center"/>
+            <w:tcBorders>
+              <w:top w:val="single" w:sz="4" w:color="D9D9D9"/>
+              <w:left w:val="single" w:sz="4" w:color="D9D9D9"/>
+              <w:bottom w:val="single" w:sz="4" w:color="D9D9D9"/>
+              <w:right w:val="single" w:sz="4" w:color="D9D9D9"/>
+              <w:insideH w:val="single" w:sz="4" w:color="D9D9D9"/>
+              <w:insideV w:val="single" w:sz="4" w:color="D9D9D9"/>
+            </w:tcBorders>
+          </w:tcPr>
+          <w:p>
+            <w:pPr>
+              <w:spacing w:after="0"/>
+            </w:pPr>
+            <w:r/>
+            <w:r>
+              <w:rPr>
+                <w:rFonts w:ascii="Microsoft YaHei" w:hAnsi="Microsoft YaHei" w:eastAsia="Microsoft YaHei"/>
+                <w:b w:val="0"/>
+                <w:sz w:val="18"/>
+              </w:rPr>
+              <w:t>O-M-P-R 因果</w:t>
+            </w:r>
+          </w:p>
+        </w:tc>
+        <w:tc>
+          <w:tcPr>
+            <w:tcW w:type="dxa" w:w="3331"/>
+            <w:vAlign w:val="center"/>
+            <w:tcBorders>
+              <w:top w:val="single" w:sz="4" w:color="D9D9D9"/>
+              <w:left w:val="single" w:sz="4" w:color="D9D9D9"/>
+              <w:bottom w:val="single" w:sz="4" w:color="D9D9D9"/>
+              <w:right w:val="single" w:sz="4" w:color="D9D9D9"/>
+              <w:insideH w:val="single" w:sz="4" w:color="D9D9D9"/>
+              <w:insideV w:val="single" w:sz="4" w:color="D9D9D9"/>
+            </w:tcBorders>
+          </w:tcPr>
+          <w:p>
+            <w:pPr>
+              <w:spacing w:after="0"/>
+            </w:pPr>
+            <w:r/>
+            <w:r>
+              <w:rPr>
+                <w:rFonts w:ascii="Microsoft YaHei" w:hAnsi="Microsoft YaHei" w:eastAsia="Microsoft YaHei"/>
+                <w:b w:val="0"/>
+                <w:sz w:val="18"/>
+              </w:rPr>
+              <w:t>20 条历史 API 运行，严格 Tuple F1 0.5128，平均/P95 10613.6/12888.4 ms</w:t>
+            </w:r>
+          </w:p>
+        </w:tc>
+        <w:tc>
+          <w:tcPr>
+            <w:tcW w:type="dxa" w:w="3331"/>
+            <w:vAlign w:val="center"/>
+            <w:tcBorders>
+              <w:top w:val="single" w:sz="4" w:color="D9D9D9"/>
+              <w:left w:val="single" w:sz="4" w:color="D9D9D9"/>
+              <w:bottom w:val="single" w:sz="4" w:color="D9D9D9"/>
+              <w:right w:val="single" w:sz="4" w:color="D9D9D9"/>
+              <w:insideH w:val="single" w:sz="4" w:color="D9D9D9"/>
+              <w:insideV w:val="single" w:sz="4" w:color="D9D9D9"/>
+            </w:tcBorders>
+          </w:tcPr>
+          <w:p>
+            <w:pPr>
+              <w:spacing w:after="0"/>
+            </w:pPr>
+            <w:r/>
+            <w:r>
+              <w:rPr>
+                <w:rFonts w:ascii="Microsoft YaHei" w:hAnsi="Microsoft YaHei" w:eastAsia="Microsoft YaHei"/>
+                <w:b w:val="0"/>
+                <w:sz w:val="18"/>
+              </w:rPr>
+              <w:t>历史问题基线；未达到 F1 0.75 与 p95 3 秒门槛</w:t>
+            </w:r>
+          </w:p>
+        </w:tc>
+      </w:tr>
+      <w:tr>
+        <w:tc>
+          <w:tcPr>
+            <w:tcW w:type="dxa" w:w="3331"/>
+            <w:vAlign w:val="center"/>
+            <w:shd w:fill="F2F6FA"/>
+            <w:tcBorders>
+              <w:top w:val="single" w:sz="4" w:color="D9D9D9"/>
+              <w:left w:val="single" w:sz="4" w:color="D9D9D9"/>
+              <w:bottom w:val="single" w:sz="4" w:color="D9D9D9"/>
+              <w:right w:val="single" w:sz="4" w:color="D9D9D9"/>
+              <w:insideH w:val="single" w:sz="4" w:color="D9D9D9"/>
+              <w:insideV w:val="single" w:sz="4" w:color="D9D9D9"/>
+            </w:tcBorders>
+          </w:tcPr>
+          <w:p>
+            <w:pPr>
+              <w:spacing w:after="0"/>
+            </w:pPr>
+            <w:r/>
+            <w:r>
+              <w:rPr>
+                <w:rFonts w:ascii="Microsoft YaHei" w:hAnsi="Microsoft YaHei" w:eastAsia="Microsoft YaHei"/>
+                <w:b w:val="0"/>
+                <w:sz w:val="18"/>
+              </w:rPr>
+              <w:t>删除验证</w:t>
+            </w:r>
+          </w:p>
+        </w:tc>
+        <w:tc>
+          <w:tcPr>
+            <w:tcW w:type="dxa" w:w="3331"/>
+            <w:vAlign w:val="center"/>
+            <w:shd w:fill="F2F6FA"/>
+            <w:tcBorders>
+              <w:top w:val="single" w:sz="4" w:color="D9D9D9"/>
+              <w:left w:val="single" w:sz="4" w:color="D9D9D9"/>
+              <w:bottom w:val="single" w:sz="4" w:color="D9D9D9"/>
+              <w:right w:val="single" w:sz="4" w:color="D9D9D9"/>
+              <w:insideH w:val="single" w:sz="4" w:color="D9D9D9"/>
+              <w:insideV w:val="single" w:sz="4" w:color="D9D9D9"/>
+            </w:tcBorders>
+          </w:tcPr>
+          <w:p>
+            <w:pPr>
+              <w:spacing w:after="0"/>
+            </w:pPr>
+            <w:r/>
+            <w:r>
+              <w:rPr>
+                <w:rFonts w:ascii="Microsoft YaHei" w:hAnsi="Microsoft YaHei" w:eastAsia="Microsoft YaHei"/>
+                <w:b w:val="0"/>
+                <w:sz w:val="18"/>
+              </w:rPr>
+              <w:t>三次删除后目标计数归零，但三次检索探针均返回目标文档</w:t>
+            </w:r>
+          </w:p>
+        </w:tc>
+        <w:tc>
+          <w:tcPr>
+            <w:tcW w:type="dxa" w:w="3331"/>
+            <w:vAlign w:val="center"/>
+            <w:shd w:fill="F2F6FA"/>
+            <w:tcBorders>
+              <w:top w:val="single" w:sz="4" w:color="D9D9D9"/>
+              <w:left w:val="single" w:sz="4" w:color="D9D9D9"/>
+              <w:bottom w:val="single" w:sz="4" w:color="D9D9D9"/>
+              <w:right w:val="single" w:sz="4" w:color="D9D9D9"/>
+              <w:insideH w:val="single" w:sz="4" w:color="D9D9D9"/>
+              <w:insideV w:val="single" w:sz="4" w:color="D9D9D9"/>
+            </w:tcBorders>
+          </w:tcPr>
+          <w:p>
+            <w:pPr>
+              <w:spacing w:after="0"/>
+            </w:pPr>
+            <w:r/>
+            <w:r>
+              <w:rPr>
+                <w:rFonts w:ascii="Microsoft YaHei" w:hAnsi="Microsoft YaHei" w:eastAsia="Microsoft YaHei"/>
+                <w:b w:val="0"/>
+                <w:sz w:val="18"/>
+              </w:rPr>
+              <w:t>失败结果；只能称跨存储删除验证，不能称机器遗忘</w:t>
+            </w:r>
+          </w:p>
+        </w:tc>
+      </w:tr>
+      <w:tr>
+        <w:tc>
+          <w:tcPr>
+            <w:tcW w:type="dxa" w:w="3331"/>
+            <w:vAlign w:val="center"/>
+            <w:tcBorders>
+              <w:top w:val="single" w:sz="4" w:color="D9D9D9"/>
+              <w:left w:val="single" w:sz="4" w:color="D9D9D9"/>
+              <w:bottom w:val="single" w:sz="4" w:color="D9D9D9"/>
+              <w:right w:val="single" w:sz="4" w:color="D9D9D9"/>
+              <w:insideH w:val="single" w:sz="4" w:color="D9D9D9"/>
+              <w:insideV w:val="single" w:sz="4" w:color="D9D9D9"/>
+            </w:tcBorders>
+          </w:tcPr>
+          <w:p>
+            <w:pPr>
+              <w:spacing w:after="0"/>
+            </w:pPr>
+            <w:r/>
+            <w:r>
+              <w:rPr>
+                <w:rFonts w:ascii="Microsoft YaHei" w:hAnsi="Microsoft YaHei" w:eastAsia="Microsoft YaHei"/>
+                <w:b w:val="0"/>
+                <w:sz w:val="18"/>
+              </w:rPr>
+              <w:t>扩展候选数据</w:t>
+            </w:r>
+          </w:p>
+        </w:tc>
+        <w:tc>
+          <w:tcPr>
+            <w:tcW w:type="dxa" w:w="3331"/>
+            <w:vAlign w:val="center"/>
+            <w:tcBorders>
+              <w:top w:val="single" w:sz="4" w:color="D9D9D9"/>
+              <w:left w:val="single" w:sz="4" w:color="D9D9D9"/>
+              <w:bottom w:val="single" w:sz="4" w:color="D9D9D9"/>
+              <w:right w:val="single" w:sz="4" w:color="D9D9D9"/>
+              <w:insideH w:val="single" w:sz="4" w:color="D9D9D9"/>
+              <w:insideV w:val="single" w:sz="4" w:color="D9D9D9"/>
+            </w:tcBorders>
+          </w:tcPr>
+          <w:p>
+            <w:pPr>
+              <w:spacing w:after="0"/>
+            </w:pPr>
+            <w:r/>
+            <w:r>
+              <w:rPr>
+                <w:rFonts w:ascii="Microsoft YaHei" w:hAnsi="Microsoft YaHei" w:eastAsia="Microsoft YaHei"/>
+                <w:b w:val="0"/>
+                <w:sz w:val="18"/>
+              </w:rPr>
+              <w:t>2400/400/400，共 3200 条，SHA-256 154e7e1a74fc...fdb25201</w:t>
+            </w:r>
+          </w:p>
+        </w:tc>
+        <w:tc>
+          <w:tcPr>
+            <w:tcW w:type="dxa" w:w="3331"/>
+            <w:vAlign w:val="center"/>
+            <w:tcBorders>
+              <w:top w:val="single" w:sz="4" w:color="D9D9D9"/>
+              <w:left w:val="single" w:sz="4" w:color="D9D9D9"/>
+              <w:bottom w:val="single" w:sz="4" w:color="D9D9D9"/>
+              <w:right w:val="single" w:sz="4" w:color="D9D9D9"/>
+              <w:insideH w:val="single" w:sz="4" w:color="D9D9D9"/>
+              <w:insideV w:val="single" w:sz="4" w:color="D9D9D9"/>
+            </w:tcBorders>
+          </w:tcPr>
+          <w:p>
+            <w:pPr>
+              <w:spacing w:after="0"/>
+            </w:pPr>
+            <w:r/>
+            <w:r>
+              <w:rPr>
+                <w:rFonts w:ascii="Microsoft YaHei" w:hAnsi="Microsoft YaHei" w:eastAsia="Microsoft YaHei"/>
+                <w:b w:val="0"/>
+                <w:sz w:val="18"/>
+              </w:rPr>
+              <w:t>可复现候选数据；synthetic_unreviewed，尚未冻结</w:t>
+            </w:r>
+          </w:p>
+        </w:tc>
+      </w:tr>
+    </w:tbl>
+    <w:p>
+      <w:pPr>
+        <w:spacing w:after="40"/>
+      </w:pPr>
+    </w:p>
+    <w:p>
+      <w:pPr>
+        <w:spacing w:after="120" w:line="283" w:lineRule="auto"/>
+      </w:pPr>
+      <w:r>
+        <w:rPr>
+          <w:rFonts w:ascii="Microsoft YaHei" w:hAnsi="Microsoft YaHei" w:eastAsia="Microsoft YaHei"/>
+          <w:b w:val="0"/>
+          <w:sz w:val="21"/>
+        </w:rPr>
+        <w:t>当前比赛材料应表述为：已完成可审计安全链路、受控来源检索和可复现数据扩充；因果准确率、在线延迟、良性误报率、大规模冻结 RRF 比较和删除后探针清零仍需在 Docker Linux 与本地 Ollama 环境中复测。实时服务和 Docker 在本机不可用时，不使用离线夹具替代在线结果。</w:t>
+      </w:r>
+    </w:p>
     <w:sectPr>
       <w:footerReference w:type="default" r:id="rId9"/>
       <w:pgSz w:w="12240" w:h="15840"/>

</xml_diff>